<commit_message>
v1.4: release links in README; paper states the release as published
</commit_message>
<xml_diff>
--- a/paper/ARC-AGI-3-paper-draft-v6.docx
+++ b/paper/ARC-AGI-3-paper-draft-v6.docx
@@ -4533,7 +4533,31 @@
         <w:pStyle w:val="FirstParagraph"/>
       </w:pPr>
       <w:r>
-        <w:t xml:space="preserve">The harness patch, the notebooks, the analysis scripts and the raw artifacts behind every table will be released under MIT-0 for our own code before the paper deadline; inherited components keep their upstream licenses and will be listed in</w:t>
+        <w:t xml:space="preserve">The harness patch, the notebooks, the analysis scripts and the raw artifacts behind every table are released under MIT-0 for our own code at</w:t>
+      </w:r>
+      <w:r>
+        <w:t xml:space="preserve"> </w:t>
+      </w:r>
+      <w:r>
+        <w:rPr>
+          <w:rStyle w:val="VerbatimChar"/>
+        </w:rPr>
+        <w:t xml:space="preserve">github.com/guoyi12311125-netizen/arc3-repeat-controlled-eval</w:t>
+      </w:r>
+      <w:r>
+        <w:t xml:space="preserve">, with a Kaggle dataset mirror at</w:t>
+      </w:r>
+      <w:r>
+        <w:t xml:space="preserve"> </w:t>
+      </w:r>
+      <w:r>
+        <w:rPr>
+          <w:rStyle w:val="VerbatimChar"/>
+        </w:rPr>
+        <w:t xml:space="preserve">kaggle.com/datasets/zgyyyl/arc3-paper-release</w:t>
+      </w:r>
+      <w:r>
+        <w:t xml:space="preserve">; inherited components keep their upstream licenses, itemised in</w:t>
       </w:r>
       <w:r>
         <w:t xml:space="preserve"> </w:t>

</xml_diff>

<commit_message>
v1.6: rebuilt PDF without the dataset reference
</commit_message>
<xml_diff>
--- a/paper/ARC-AGI-3-paper-draft-v6.docx
+++ b/paper/ARC-AGI-3-paper-draft-v6.docx
@@ -4543,18 +4543,6 @@
           <w:rStyle w:val="VerbatimChar"/>
         </w:rPr>
         <w:t xml:space="preserve">github.com/guoyi12311125-netizen/arc3-repeat-controlled-eval</w:t>
-      </w:r>
-      <w:r>
-        <w:t xml:space="preserve">, with a Kaggle dataset mirror at</w:t>
-      </w:r>
-      <w:r>
-        <w:t xml:space="preserve"> </w:t>
-      </w:r>
-      <w:r>
-        <w:rPr>
-          <w:rStyle w:val="VerbatimChar"/>
-        </w:rPr>
-        <w:t xml:space="preserve">kaggle.com/datasets/zgyyyl/arc3-paper-release</w:t>
       </w:r>
       <w:r>
         <w:t xml:space="preserve">; inherited components keep their upstream licenses, itemised in</w:t>

</xml_diff>